<commit_message>
Fix 7 Oct totals: count Usman Idrees once (1,254 total)
Co-Authored-By: Claude Sonnet 5.5 <noreply@anthropic.com>
Claude-Session: https://claude.ai/code/session_01Y3V5mhbu8nznWPRDFjfQZx
</commit_message>
<xml_diff>
--- a/IGP_Brief_07-10-2026.docx
+++ b/IGP_Brief_07-10-2026.docx
@@ -354,7 +354,7 @@
           <w:sz w:val="28"/>
           <w:szCs w:val="24"/>
         </w:rPr>
-        <w:t xml:space="preserve">Total cases: 1,255</w:t>
+        <w:t xml:space="preserve">Total cases: 1,254</w:t>
       </w:r>
       <w:r>
         <w:rPr>
@@ -399,7 +399,7 @@
           <w:sz w:val="28"/>
           <w:szCs w:val="24"/>
         </w:rPr>
-        <w:t xml:space="preserve">1,244</w:t>
+        <w:t xml:space="preserve">1,243</w:t>
       </w:r>
       <w:r>
         <w:rPr>
@@ -414,7 +414,7 @@
           <w:sz w:val="28"/>
           <w:szCs w:val="24"/>
         </w:rPr>
-        <w:t xml:space="preserve">38</w:t>
+        <w:t xml:space="preserve">37</w:t>
       </w:r>
       <w:r>
         <w:rPr>
@@ -820,7 +820,7 @@
           <w:sz w:val="28"/>
           <w:szCs w:val="24"/>
         </w:rPr>
-        <w:t xml:space="preserve">Total cases: 1,211</w:t>
+        <w:t xml:space="preserve">Total cases: 1,210</w:t>
       </w:r>
       <w:r>
         <w:rPr>
@@ -850,7 +850,7 @@
           <w:sz w:val="28"/>
           <w:szCs w:val="24"/>
         </w:rPr>
-        <w:t xml:space="preserve">1,200</w:t>
+        <w:t xml:space="preserve">1,199</w:t>
       </w:r>
       <w:r>
         <w:rPr>
@@ -865,7 +865,7 @@
           <w:sz w:val="28"/>
           <w:szCs w:val="24"/>
         </w:rPr>
-        <w:t xml:space="preserve">36</w:t>
+        <w:t xml:space="preserve">35</w:t>
       </w:r>
       <w:r>
         <w:rPr>

</xml_diff>

<commit_message>
Final 7 Oct brief and WhatsApp message
Co-Authored-By: Claude Sonnet 5.5 <noreply@anthropic.com>
Claude-Session: https://claude.ai/code/session_01Y3V5mhbu8nznWPRDFjfQZx
</commit_message>
<xml_diff>
--- a/IGP_Brief_07-10-2026.docx
+++ b/IGP_Brief_07-10-2026.docx
@@ -34,7 +34,7 @@
         <w:jc w:val="center"/>
       </w:pPr>
       <w:r>
-        <w:t xml:space="preserve">Position as on 7 October 2026</w:t>
+        <w:t>Position as on 7 October 2026</w:t>
       </w:r>
     </w:p>
     <w:p>
@@ -203,14 +203,15 @@
           <w:sz w:val="28"/>
           <w:szCs w:val="24"/>
         </w:rPr>
-        <w:t xml:space="preserve">Issue - Lodging points, Attock (9 points):</w:t>
-      </w:r>
-      <w:r>
-        <w:rPr>
-          <w:sz w:val="28"/>
-          <w:szCs w:val="24"/>
-        </w:rPr>
-        <w:t xml:space="preserve"> Demand for three meals a day and tea (with boiled egg at breakfast); water filters not installed with coolers (6 points, incl. Govt. Boys High School Nartopa); 2 of 4 water coolers out of order and underground water not fit for drinking at Govt. High School Faqeer Abad; water tanks need cleaning (Shuja Khanzada Degree College Hazro); pest control spray required.</w:t>
+        <w:t>Issue - Lodging points, Attock (9 points):</w:t>
+      </w:r>
+      <w:r>
+        <w:rPr>
+          <w:b w:val="0"/>
+          <w:sz w:val="28"/>
+          <w:szCs w:val="24"/>
+        </w:rPr>
+        <w:t xml:space="preserve"> Demand for three meals a day; water filters not installed at 6 points; 2 of 4 water coolers out of order and underground water not fit for drinking at Govt. High School Faqeer Abad; water storage tanks need cleaning at Govt. Shuja Khanzada Degree College Hazro; tea/breakfast improvement requested at some points; pest control spray required.</w:t>
       </w:r>
     </w:p>
     <w:p>
@@ -233,14 +234,15 @@
           <w:sz w:val="28"/>
           <w:szCs w:val="24"/>
         </w:rPr>
-        <w:t xml:space="preserve">Action / Solution Taken:</w:t>
-      </w:r>
-      <w:r>
-        <w:rPr>
-          <w:sz w:val="28"/>
-          <w:szCs w:val="24"/>
-        </w:rPr>
-        <w:t xml:space="preserve"> Food is provided two times a day as per prescribed procedure. DPO apprised to install water filters where possible, repair coolers, clean tanks and arrange pest control spray.</w:t>
+        <w:t>Action / Solution Taken:</w:t>
+      </w:r>
+      <w:r>
+        <w:rPr>
+          <w:b w:val="0"/>
+          <w:sz w:val="28"/>
+          <w:szCs w:val="24"/>
+        </w:rPr>
+        <w:t xml:space="preserve"> Food is provided two times a day as per prescribed procedure. DPO apprised to install water filters where possible, repair coolers, clean water tanks and arrange pest control spray.</w:t>
       </w:r>
     </w:p>
     <w:p>
@@ -263,10 +265,11 @@
           <w:sz w:val="28"/>
           <w:szCs w:val="24"/>
         </w:rPr>
-        <w:t xml:space="preserve">Current Position:</w:t>
-      </w:r>
-      <w:r>
-        <w:rPr>
+        <w:t>Current Position:</w:t>
+      </w:r>
+      <w:r>
+        <w:rPr>
+          <w:b w:val="0"/>
           <w:sz w:val="28"/>
           <w:szCs w:val="24"/>
         </w:rPr>
@@ -278,10 +281,11 @@
           <w:sz w:val="28"/>
           <w:szCs w:val="24"/>
         </w:rPr>
-        <w:t xml:space="preserve">6</w:t>
-      </w:r>
-      <w:r>
-        <w:rPr>
+        <w:t>6</w:t>
+      </w:r>
+      <w:r>
+        <w:rPr>
+          <w:b w:val="0"/>
           <w:sz w:val="28"/>
           <w:szCs w:val="24"/>
         </w:rPr>
@@ -320,6 +324,7 @@
       </w:pPr>
       <w:r>
         <w:rPr>
+          <w:b w:val="0"/>
           <w:sz w:val="28"/>
           <w:szCs w:val="24"/>
         </w:rPr>
@@ -331,7 +336,7 @@
           <w:sz w:val="28"/>
           <w:szCs w:val="24"/>
         </w:rPr>
-        <w:t xml:space="preserve">Overall (21 Sep - 7 Oct):</w:t>
+        <w:t>Overall (21 Sep - 7 Oct):</w:t>
       </w:r>
     </w:p>
     <w:p>
@@ -354,10 +359,11 @@
           <w:sz w:val="28"/>
           <w:szCs w:val="24"/>
         </w:rPr>
-        <w:t xml:space="preserve">Total cases: 1,254</w:t>
-      </w:r>
-      <w:r>
-        <w:rPr>
+        <w:t>Total cases: 1,254</w:t>
+      </w:r>
+      <w:r>
+        <w:rPr>
+          <w:b w:val="0"/>
           <w:sz w:val="28"/>
           <w:szCs w:val="24"/>
         </w:rPr>
@@ -369,10 +375,11 @@
           <w:sz w:val="28"/>
           <w:szCs w:val="24"/>
         </w:rPr>
-        <w:t xml:space="preserve">5</w:t>
-      </w:r>
-      <w:r>
-        <w:rPr>
+        <w:t>5</w:t>
+      </w:r>
+      <w:r>
+        <w:rPr>
+          <w:b w:val="0"/>
           <w:sz w:val="28"/>
           <w:szCs w:val="24"/>
         </w:rPr>
@@ -384,10 +391,11 @@
           <w:sz w:val="28"/>
           <w:szCs w:val="24"/>
         </w:rPr>
-        <w:t xml:space="preserve">6</w:t>
-      </w:r>
-      <w:r>
-        <w:rPr>
+        <w:t>6</w:t>
+      </w:r>
+      <w:r>
+        <w:rPr>
+          <w:b w:val="0"/>
           <w:sz w:val="28"/>
           <w:szCs w:val="24"/>
         </w:rPr>
@@ -399,10 +407,11 @@
           <w:sz w:val="28"/>
           <w:szCs w:val="24"/>
         </w:rPr>
-        <w:t xml:space="preserve">1,243</w:t>
-      </w:r>
-      <w:r>
-        <w:rPr>
+        <w:t>1,243</w:t>
+      </w:r>
+      <w:r>
+        <w:rPr>
+          <w:b w:val="0"/>
           <w:sz w:val="28"/>
           <w:szCs w:val="24"/>
         </w:rPr>
@@ -414,10 +423,11 @@
           <w:sz w:val="28"/>
           <w:szCs w:val="24"/>
         </w:rPr>
-        <w:t xml:space="preserve">37</w:t>
-      </w:r>
-      <w:r>
-        <w:rPr>
+        <w:t>37</w:t>
+      </w:r>
+      <w:r>
+        <w:rPr>
+          <w:b w:val="0"/>
           <w:sz w:val="28"/>
           <w:szCs w:val="24"/>
         </w:rPr>
@@ -429,10 +439,11 @@
           <w:sz w:val="28"/>
           <w:szCs w:val="24"/>
         </w:rPr>
-        <w:t xml:space="preserve">1,206</w:t>
-      </w:r>
-      <w:r>
-        <w:rPr>
+        <w:t>1,206</w:t>
+      </w:r>
+      <w:r>
+        <w:rPr>
+          <w:b w:val="0"/>
           <w:sz w:val="28"/>
           <w:szCs w:val="24"/>
         </w:rPr>
@@ -444,10 +455,11 @@
           <w:sz w:val="28"/>
           <w:szCs w:val="24"/>
         </w:rPr>
-        <w:t xml:space="preserve">7</w:t>
-      </w:r>
-      <w:r>
-        <w:rPr>
+        <w:t>6</w:t>
+      </w:r>
+      <w:r>
+        <w:rPr>
+          <w:b w:val="0"/>
           <w:sz w:val="28"/>
           <w:szCs w:val="24"/>
         </w:rPr>
@@ -467,6 +479,7 @@
       </w:pPr>
       <w:r>
         <w:rPr>
+          <w:b w:val="0"/>
           <w:sz w:val="28"/>
           <w:szCs w:val="24"/>
         </w:rPr>
@@ -478,7 +491,7 @@
           <w:sz w:val="28"/>
           <w:szCs w:val="24"/>
         </w:rPr>
-        <w:t xml:space="preserve">7 Oct (till [time]):</w:t>
+        <w:t>7 Oct:</w:t>
       </w:r>
     </w:p>
     <w:p>
@@ -501,10 +514,11 @@
           <w:sz w:val="28"/>
           <w:szCs w:val="24"/>
         </w:rPr>
-        <w:t xml:space="preserve">Sick: 44</w:t>
-      </w:r>
-      <w:r>
-        <w:rPr>
+        <w:t>Sick: 44</w:t>
+      </w:r>
+      <w:r>
+        <w:rPr>
+          <w:b w:val="0"/>
           <w:sz w:val="28"/>
           <w:szCs w:val="24"/>
         </w:rPr>
@@ -516,10 +530,11 @@
           <w:sz w:val="28"/>
           <w:szCs w:val="24"/>
         </w:rPr>
-        <w:t xml:space="preserve">15</w:t>
-      </w:r>
-      <w:r>
-        <w:rPr>
+        <w:t>15</w:t>
+      </w:r>
+      <w:r>
+        <w:rPr>
+          <w:b w:val="0"/>
           <w:sz w:val="28"/>
           <w:szCs w:val="24"/>
         </w:rPr>
@@ -531,14 +546,15 @@
           <w:sz w:val="28"/>
           <w:szCs w:val="24"/>
         </w:rPr>
-        <w:t xml:space="preserve">2</w:t>
-      </w:r>
-      <w:r>
-        <w:rPr>
-          <w:sz w:val="28"/>
-          <w:szCs w:val="24"/>
-        </w:rPr>
-        <w:t xml:space="preserve"> referred to RIC Rawalpindi (Abdul Sattar, cook, Muzaffargarh, chest pain - from THQ Hassan Abdal; Dilshad Ali SI, Layyah, heart problem and BP issue - from THQ Hazro); </w:t>
+        <w:t>2</w:t>
+      </w:r>
+      <w:r>
+        <w:rPr>
+          <w:b w:val="0"/>
+          <w:sz w:val="28"/>
+          <w:szCs w:val="24"/>
+        </w:rPr>
+        <w:t xml:space="preserve"> referred to RIC Rawalpindi - Abdul Sattar, Cook (chest pain) and Dilshaad Ali SI 751/DG (heart/BP issue); </w:t>
       </w:r>
       <w:r>
         <w:rPr>
@@ -546,10 +562,11 @@
           <w:sz w:val="28"/>
           <w:szCs w:val="24"/>
         </w:rPr>
-        <w:t xml:space="preserve">42</w:t>
-      </w:r>
-      <w:r>
-        <w:rPr>
+        <w:t>42</w:t>
+      </w:r>
+      <w:r>
+        <w:rPr>
+          <w:b w:val="0"/>
           <w:sz w:val="28"/>
           <w:szCs w:val="24"/>
         </w:rPr>
@@ -561,14 +578,15 @@
           <w:sz w:val="28"/>
           <w:szCs w:val="24"/>
         </w:rPr>
-        <w:t xml:space="preserve">27</w:t>
-      </w:r>
-      <w:r>
-        <w:rPr>
-          <w:sz w:val="28"/>
-          <w:szCs w:val="24"/>
-        </w:rPr>
-        <w:t xml:space="preserve">), THQ Hazro (</w:t>
+        <w:t>27</w:t>
+      </w:r>
+      <w:r>
+        <w:rPr>
+          <w:b w:val="0"/>
+          <w:sz w:val="28"/>
+          <w:szCs w:val="24"/>
+        </w:rPr>
+        <w:t>), THQ Hazro (</w:t>
       </w:r>
       <w:r>
         <w:rPr>
@@ -576,14 +594,15 @@
           <w:sz w:val="28"/>
           <w:szCs w:val="24"/>
         </w:rPr>
-        <w:t xml:space="preserve">14</w:t>
-      </w:r>
-      <w:r>
-        <w:rPr>
-          <w:sz w:val="28"/>
-          <w:szCs w:val="24"/>
-        </w:rPr>
-        <w:t xml:space="preserve">) and THQ Fateh Jang (</w:t>
+        <w:t>14</w:t>
+      </w:r>
+      <w:r>
+        <w:rPr>
+          <w:b w:val="0"/>
+          <w:sz w:val="28"/>
+          <w:szCs w:val="24"/>
+        </w:rPr>
+        <w:t>) and THQ Fateh Jang (</w:t>
       </w:r>
       <w:r>
         <w:rPr>
@@ -591,14 +610,15 @@
           <w:sz w:val="28"/>
           <w:szCs w:val="24"/>
         </w:rPr>
-        <w:t xml:space="preserve">1</w:t>
-      </w:r>
-      <w:r>
-        <w:rPr>
-          <w:sz w:val="28"/>
-          <w:szCs w:val="24"/>
-        </w:rPr>
-        <w:t xml:space="preserve">).</w:t>
+        <w:t>1</w:t>
+      </w:r>
+      <w:r>
+        <w:rPr>
+          <w:b w:val="0"/>
+          <w:sz w:val="28"/>
+          <w:szCs w:val="24"/>
+        </w:rPr>
+        <w:t>).</w:t>
       </w:r>
     </w:p>
     <w:p>
@@ -617,10 +637,11 @@
       </w:pPr>
       <w:r>
         <w:rPr>
-          <w:sz w:val="28"/>
-          <w:szCs w:val="24"/>
-        </w:rPr>
-        <w:t xml:space="preserve">No death, injury, dengue or missing case.</w:t>
+          <w:b w:val="0"/>
+          <w:sz w:val="28"/>
+          <w:szCs w:val="24"/>
+        </w:rPr>
+        <w:t>No death, injury, dengue or missing case.</w:t>
       </w:r>
     </w:p>
     <w:p>
@@ -636,6 +657,7 @@
       </w:pPr>
       <w:r>
         <w:rPr>
+          <w:b w:val="0"/>
           <w:sz w:val="28"/>
           <w:szCs w:val="24"/>
         </w:rPr>
@@ -647,7 +669,7 @@
           <w:sz w:val="28"/>
           <w:szCs w:val="24"/>
         </w:rPr>
-        <w:t xml:space="preserve">21 Sep - 6 Oct:</w:t>
+        <w:t>21 Sep - 6 Oct:</w:t>
       </w:r>
     </w:p>
     <w:p>
@@ -670,14 +692,15 @@
           <w:sz w:val="28"/>
           <w:szCs w:val="24"/>
         </w:rPr>
-        <w:t xml:space="preserve">Deaths: 5</w:t>
-      </w:r>
-      <w:r>
-        <w:rPr>
-          <w:sz w:val="28"/>
-          <w:szCs w:val="24"/>
-        </w:rPr>
-        <w:t xml:space="preserve"> - Zulfiqar Ahmed (DG Khan), heart attack while sleeping, 25.09.2026; Zain 1683/C (M.B. Din), drowned in 1122 canal at Ghaziabad, 26.09.2026 (dead body recovered); Driver Constable M. Imran 183/DC (RMP Multan), passed away at PIMS, Islamabad, 02.10.2026; Muhammad Shahzad 335/DC (Kot Addu), heart attack, 04.10.2026; Usman Idrees, cook (PC 07 Lahore), kidney disease/low BP (referred to his district on 23.09.2026), death reported 06.10.2026.</w:t>
+        <w:t>Deaths: 5</w:t>
+      </w:r>
+      <w:r>
+        <w:rPr>
+          <w:b w:val="0"/>
+          <w:sz w:val="28"/>
+          <w:szCs w:val="24"/>
+        </w:rPr>
+        <w:t xml:space="preserve"> - Zulfiqar Ahmed (DG Khan), heart attack while sleeping, 25.09.2026; Zain 1683/C (M.B. Din), drowned in 1122 canal at Ghaziabad, 26.09.2026 (dead body recovered); Driver Constable M. Imran 183/DC (RMP Multan), passed away at PIMS, Islamabad, 02.10.2026; Muhammad Shahzad 335/DC (Kot Addu), heart attack, 04.10.2026; Usman Idrees, Cook (PC 07 Lahore), death reported on 06.10.2026 after having been referred to his district on 23.09.2026 with kidney disease/low BP.</w:t>
       </w:r>
     </w:p>
     <w:p>
@@ -700,10 +723,11 @@
           <w:sz w:val="28"/>
           <w:szCs w:val="24"/>
         </w:rPr>
-        <w:t xml:space="preserve">Injured: 6</w:t>
-      </w:r>
-      <w:r>
-        <w:rPr>
+        <w:t>Injured: 6</w:t>
+      </w:r>
+      <w:r>
+        <w:rPr>
+          <w:b w:val="0"/>
           <w:sz w:val="28"/>
           <w:szCs w:val="24"/>
         </w:rPr>
@@ -730,10 +754,11 @@
           <w:sz w:val="28"/>
           <w:szCs w:val="24"/>
         </w:rPr>
-        <w:t xml:space="preserve">Dengue: 7</w:t>
-      </w:r>
-      <w:r>
-        <w:rPr>
+        <w:t>Dengue: 6</w:t>
+      </w:r>
+      <w:r>
+        <w:rPr>
+          <w:b w:val="0"/>
           <w:sz w:val="28"/>
           <w:szCs w:val="24"/>
         </w:rPr>
@@ -745,29 +770,15 @@
           <w:sz w:val="28"/>
           <w:szCs w:val="24"/>
         </w:rPr>
-        <w:t xml:space="preserve">1</w:t>
-      </w:r>
-      <w:r>
-        <w:rPr>
-          <w:sz w:val="28"/>
-          <w:szCs w:val="24"/>
-        </w:rPr>
-        <w:t xml:space="preserve"> referred to BBH Rawalpindi; </w:t>
-      </w:r>
-      <w:r>
-        <w:rPr>
-          <w:b/>
-          <w:sz w:val="28"/>
-          <w:szCs w:val="24"/>
-        </w:rPr>
-        <w:t xml:space="preserve">2</w:t>
-      </w:r>
-      <w:r>
-        <w:rPr>
-          <w:sz w:val="28"/>
-          <w:szCs w:val="24"/>
-        </w:rPr>
-        <w:t xml:space="preserve"> new on 06.10.2026 - M. Hafeez 1967/C (RMP Faisalabad), fever with dengue, returned to concerned district, and Amanullah 704/C (RMP Faisalabad), suspected dengue, refused admission; others treated/discharged.</w:t>
+        <w:t>1</w:t>
+      </w:r>
+      <w:r>
+        <w:rPr>
+          <w:b w:val="0"/>
+          <w:sz w:val="28"/>
+          <w:szCs w:val="24"/>
+        </w:rPr>
+        <w:t xml:space="preserve"> referred to BBH Rawalpindi; M. Hafeez 1967/C (RMP Faisalabad) returned to concerned district on 06.10.2026; others treated/discharged.</w:t>
       </w:r>
     </w:p>
     <w:p>
@@ -790,10 +801,11 @@
           <w:sz w:val="28"/>
           <w:szCs w:val="24"/>
         </w:rPr>
-        <w:t xml:space="preserve">Snake bite: 1</w:t>
-      </w:r>
-      <w:r>
-        <w:rPr>
+        <w:t>Snake bite: 1</w:t>
+      </w:r>
+      <w:r>
+        <w:rPr>
+          <w:b w:val="0"/>
           <w:sz w:val="28"/>
           <w:szCs w:val="24"/>
         </w:rPr>
@@ -820,10 +832,11 @@
           <w:sz w:val="28"/>
           <w:szCs w:val="24"/>
         </w:rPr>
-        <w:t xml:space="preserve">Total cases: 1,210</w:t>
-      </w:r>
-      <w:r>
-        <w:rPr>
+        <w:t>Total cases: 1,210</w:t>
+      </w:r>
+      <w:r>
+        <w:rPr>
+          <w:b w:val="0"/>
           <w:sz w:val="28"/>
           <w:szCs w:val="24"/>
         </w:rPr>
@@ -835,10 +848,11 @@
           <w:sz w:val="28"/>
           <w:szCs w:val="24"/>
         </w:rPr>
-        <w:t xml:space="preserve">11</w:t>
-      </w:r>
-      <w:r>
-        <w:rPr>
+        <w:t>11</w:t>
+      </w:r>
+      <w:r>
+        <w:rPr>
+          <w:b w:val="0"/>
           <w:sz w:val="28"/>
           <w:szCs w:val="24"/>
         </w:rPr>
@@ -850,10 +864,11 @@
           <w:sz w:val="28"/>
           <w:szCs w:val="24"/>
         </w:rPr>
-        <w:t xml:space="preserve">1,199</w:t>
-      </w:r>
-      <w:r>
-        <w:rPr>
+        <w:t>1,199</w:t>
+      </w:r>
+      <w:r>
+        <w:rPr>
+          <w:b w:val="0"/>
           <w:sz w:val="28"/>
           <w:szCs w:val="24"/>
         </w:rPr>
@@ -865,10 +880,11 @@
           <w:sz w:val="28"/>
           <w:szCs w:val="24"/>
         </w:rPr>
-        <w:t xml:space="preserve">35</w:t>
-      </w:r>
-      <w:r>
-        <w:rPr>
+        <w:t>35</w:t>
+      </w:r>
+      <w:r>
+        <w:rPr>
+          <w:b w:val="0"/>
           <w:sz w:val="28"/>
           <w:szCs w:val="24"/>
         </w:rPr>
@@ -880,10 +896,11 @@
           <w:sz w:val="28"/>
           <w:szCs w:val="24"/>
         </w:rPr>
-        <w:t xml:space="preserve">1,164</w:t>
-      </w:r>
-      <w:r>
-        <w:rPr>
+        <w:t>1,164</w:t>
+      </w:r>
+      <w:r>
+        <w:rPr>
+          <w:b w:val="0"/>
           <w:sz w:val="28"/>
           <w:szCs w:val="24"/>
         </w:rPr>
@@ -2282,10 +2299,11 @@
           <w:sz w:val="28"/>
           <w:szCs w:val="24"/>
         </w:rPr>
-        <w:t xml:space="preserve">Tele personnel:</w:t>
-      </w:r>
-      <w:r>
-        <w:rPr>
+        <w:t>Tele personnel:</w:t>
+      </w:r>
+      <w:r>
+        <w:rPr>
+          <w:b w:val="0"/>
           <w:sz w:val="28"/>
           <w:szCs w:val="24"/>
         </w:rPr>
@@ -2297,10 +2315,11 @@
           <w:sz w:val="28"/>
           <w:szCs w:val="24"/>
         </w:rPr>
-        <w:t xml:space="preserve">143</w:t>
-      </w:r>
-      <w:r>
-        <w:rPr>
+        <w:t>143</w:t>
+      </w:r>
+      <w:r>
+        <w:rPr>
+          <w:b w:val="0"/>
           <w:sz w:val="28"/>
           <w:szCs w:val="24"/>
         </w:rPr>
@@ -2312,10 +2331,11 @@
           <w:sz w:val="28"/>
           <w:szCs w:val="24"/>
         </w:rPr>
-        <w:t xml:space="preserve">146</w:t>
-      </w:r>
-      <w:r>
-        <w:rPr>
+        <w:t>146</w:t>
+      </w:r>
+      <w:r>
+        <w:rPr>
+          <w:b w:val="0"/>
           <w:sz w:val="28"/>
           <w:szCs w:val="24"/>
         </w:rPr>
@@ -2327,14 +2347,15 @@
           <w:sz w:val="28"/>
           <w:szCs w:val="24"/>
         </w:rPr>
-        <w:t xml:space="preserve">0</w:t>
-      </w:r>
-      <w:r>
-        <w:rPr>
-          <w:sz w:val="28"/>
-          <w:szCs w:val="24"/>
-        </w:rPr>
-        <w:t xml:space="preserve">.</w:t>
+        <w:t>0</w:t>
+      </w:r>
+      <w:r>
+        <w:rPr>
+          <w:b w:val="0"/>
+          <w:sz w:val="28"/>
+          <w:szCs w:val="24"/>
+        </w:rPr>
+        <w:t>.</w:t>
       </w:r>
     </w:p>
     <w:p>
@@ -2660,10 +2681,6 @@
     <w:sectPr>
       <w:headerReference w:type="default" r:id="rId8"/>
       <w:footerReference w:type="default" r:id="rId9"/>
-      <w:footerReference w:type="first" r:id="rId12"/>
-      <w:headerReference w:type="first" r:id="rId13"/>
-      <w:footerReference w:type="even" r:id="rId14"/>
-      <w:headerReference w:type="even" r:id="rId15"/>
       <w:pgSz w:w="12240" w:h="15840"/>
       <w:pgMar w:top="1530" w:right="979" w:bottom="1260" w:left="979" w:header="720" w:footer="720" w:gutter="0"/>
       <w:cols w:space="720"/>
@@ -2715,26 +2732,6 @@
 </w:ftr>
 </file>
 
-<file path=word/footer2.xml><?xml version="1.0" encoding="utf-8"?>
-<w:ftr xmlns:m="http://schemas.openxmlformats.org/officeDocument/2006/math" xmlns:mc="http://schemas.openxmlformats.org/markup-compatibility/2006" xmlns:mo="http://schemas.microsoft.com/office/mac/office/2008/main" xmlns:mv="urn:schemas-microsoft-com:mac:vml" xmlns:o="urn:schemas-microsoft-com:office:office" xmlns:r="http://schemas.openxmlformats.org/officeDocument/2006/relationships" xmlns:v="urn:schemas-microsoft-com:vml" xmlns:w10="urn:schemas-microsoft-com:office:word" xmlns:w14="http://schemas.microsoft.com/office/word/2010/wordml" xmlns:w="http://schemas.openxmlformats.org/wordprocessingml/2006/main" xmlns:wne="http://schemas.microsoft.com/office/word/2006/wordml" xmlns:wp14="http://schemas.microsoft.com/office/word/2010/wordprocessingDrawing" xmlns:wp="http://schemas.openxmlformats.org/drawingml/2006/wordprocessingDrawing" xmlns:wpc="http://schemas.microsoft.com/office/word/2010/wordprocessingCanvas" xmlns:wpg="http://schemas.microsoft.com/office/word/2010/wordprocessingGroup" xmlns:wpi="http://schemas.microsoft.com/office/word/2010/wordprocessingInk" xmlns:wps="http://schemas.microsoft.com/office/word/2010/wordprocessingShape" mc:Ignorable="w14 wp14">
-  <w:p>
-    <w:pPr>
-      <w:pStyle w:val="Footer"/>
-    </w:pPr>
-  </w:p>
-</w:ftr>
-</file>
-
-<file path=word/footer3.xml><?xml version="1.0" encoding="utf-8"?>
-<w:ftr xmlns:m="http://schemas.openxmlformats.org/officeDocument/2006/math" xmlns:mc="http://schemas.openxmlformats.org/markup-compatibility/2006" xmlns:mo="http://schemas.microsoft.com/office/mac/office/2008/main" xmlns:mv="urn:schemas-microsoft-com:mac:vml" xmlns:o="urn:schemas-microsoft-com:office:office" xmlns:r="http://schemas.openxmlformats.org/officeDocument/2006/relationships" xmlns:v="urn:schemas-microsoft-com:vml" xmlns:w10="urn:schemas-microsoft-com:office:word" xmlns:w14="http://schemas.microsoft.com/office/word/2010/wordml" xmlns:w="http://schemas.openxmlformats.org/wordprocessingml/2006/main" xmlns:wne="http://schemas.microsoft.com/office/word/2006/wordml" xmlns:wp14="http://schemas.microsoft.com/office/word/2010/wordprocessingDrawing" xmlns:wp="http://schemas.openxmlformats.org/drawingml/2006/wordprocessingDrawing" xmlns:wpc="http://schemas.microsoft.com/office/word/2010/wordprocessingCanvas" xmlns:wpg="http://schemas.microsoft.com/office/word/2010/wordprocessingGroup" xmlns:wpi="http://schemas.microsoft.com/office/word/2010/wordprocessingInk" xmlns:wps="http://schemas.microsoft.com/office/word/2010/wordprocessingShape" mc:Ignorable="w14 wp14">
-  <w:p>
-    <w:pPr>
-      <w:pStyle w:val="Footer"/>
-    </w:pPr>
-  </w:p>
-</w:ftr>
-</file>
-
 <file path=word/footnotes.xml><?xml version="1.0" encoding="utf-8"?>
 <w:footnotes xmlns:wpc="http://schemas.microsoft.com/office/word/2010/wordprocessingCanvas" xmlns:cx="http://schemas.microsoft.com/office/drawing/2014/chartex" xmlns:cx1="http://schemas.microsoft.com/office/drawing/2015/9/8/chartex" xmlns:cx2="http://schemas.microsoft.com/office/drawing/2015/10/21/chartex" xmlns:cx3="http://schemas.microsoft.com/office/drawing/2016/5/9/chartex" xmlns:cx4="http://schemas.microsoft.com/office/drawing/2016/5/10/chartex" xmlns:cx5="http://schemas.microsoft.com/office/drawing/2016/5/11/chartex" xmlns:cx6="http://schemas.microsoft.com/office/drawing/2016/5/12/chartex" xmlns:cx7="http://schemas.microsoft.com/office/drawing/2016/5/13/chartex" xmlns:cx8="http://schemas.microsoft.com/office/drawing/2016/5/14/chartex" xmlns:mc="http://schemas.openxmlformats.org/markup-compatibility/2006" xmlns:aink="http://schemas.microsoft.com/office/drawing/2016/ink" xmlns:am3d="http://schemas.microsoft.com/office/drawing/2017/model3d" xmlns:o="urn:schemas-microsoft-com:office:office" xmlns:oel="http://schemas.microsoft.com/office/2019/extlst" xmlns:r="http://schemas.openxmlformats.org/officeDocument/2006/relationships" xmlns:m="http://schemas.openxmlformats.org/officeDocument/2006/math" xmlns:v="urn:schemas-microsoft-com:vml" xmlns:wp14="http://schemas.microsoft.com/office/word/2010/wordprocessingDrawing" xmlns:wp="http://schemas.openxmlformats.org/drawingml/2006/wordprocessingDrawing" xmlns:w10="urn:schemas-microsoft-com:office:word" xmlns:w="http://schemas.openxmlformats.org/wordprocessingml/2006/main" xmlns:w14="http://schemas.microsoft.com/office/word/2010/wordml" xmlns:w15="http://schemas.microsoft.com/office/word/2012/wordml" xmlns:w16cex="http://schemas.microsoft.com/office/word/2018/wordml/cex" xmlns:w16cid="http://schemas.microsoft.com/office/word/2016/wordml/cid" xmlns:w16="http://schemas.microsoft.com/office/word/2018/wordml" xmlns:w16du="http://schemas.microsoft.com/office/word/2023/wordml/word16du" xmlns:w16sdtdh="http://schemas.microsoft.com/office/word/2020/wordml/sdtdatahash" xmlns:w16sdtfl="http://schemas.microsoft.com/office/word/2024/wordml/sdtformatlock" xmlns:w16se="http://schemas.microsoft.com/office/word/2015/wordml/symex" xmlns:wpg="http://schemas.microsoft.com/office/word/2010/wordprocessingGroup" xmlns:wpi="http://schemas.microsoft.com/office/word/2010/wordprocessingInk" xmlns:wne="http://schemas.microsoft.com/office/word/2006/wordml" xmlns:wps="http://schemas.microsoft.com/office/word/2010/wordprocessingShape" mc:Ignorable="w14 w15 w16se w16cid w16 w16cex w16sdtdh w16sdtfl w16du wp14">
   <w:footnote w:type="separator" w:id="-1">
@@ -2774,26 +2771,6 @@
       </w:rPr>
       <w:t>PUNJAB POLICE | OPERATIONS BRANCH</w:t>
     </w:r>
-  </w:p>
-</w:hdr>
-</file>
-
-<file path=word/header2.xml><?xml version="1.0" encoding="utf-8"?>
-<w:hdr xmlns:m="http://schemas.openxmlformats.org/officeDocument/2006/math" xmlns:mc="http://schemas.openxmlformats.org/markup-compatibility/2006" xmlns:mo="http://schemas.microsoft.com/office/mac/office/2008/main" xmlns:mv="urn:schemas-microsoft-com:mac:vml" xmlns:o="urn:schemas-microsoft-com:office:office" xmlns:r="http://schemas.openxmlformats.org/officeDocument/2006/relationships" xmlns:v="urn:schemas-microsoft-com:vml" xmlns:w10="urn:schemas-microsoft-com:office:word" xmlns:w14="http://schemas.microsoft.com/office/word/2010/wordml" xmlns:w="http://schemas.openxmlformats.org/wordprocessingml/2006/main" xmlns:wne="http://schemas.microsoft.com/office/word/2006/wordml" xmlns:wp14="http://schemas.microsoft.com/office/word/2010/wordprocessingDrawing" xmlns:wp="http://schemas.openxmlformats.org/drawingml/2006/wordprocessingDrawing" xmlns:wpc="http://schemas.microsoft.com/office/word/2010/wordprocessingCanvas" xmlns:wpg="http://schemas.microsoft.com/office/word/2010/wordprocessingGroup" xmlns:wpi="http://schemas.microsoft.com/office/word/2010/wordprocessingInk" xmlns:wps="http://schemas.microsoft.com/office/word/2010/wordprocessingShape" mc:Ignorable="w14 wp14">
-  <w:p>
-    <w:pPr>
-      <w:pStyle w:val="Header"/>
-    </w:pPr>
-  </w:p>
-</w:hdr>
-</file>
-
-<file path=word/header3.xml><?xml version="1.0" encoding="utf-8"?>
-<w:hdr xmlns:m="http://schemas.openxmlformats.org/officeDocument/2006/math" xmlns:mc="http://schemas.openxmlformats.org/markup-compatibility/2006" xmlns:mo="http://schemas.microsoft.com/office/mac/office/2008/main" xmlns:mv="urn:schemas-microsoft-com:mac:vml" xmlns:o="urn:schemas-microsoft-com:office:office" xmlns:r="http://schemas.openxmlformats.org/officeDocument/2006/relationships" xmlns:v="urn:schemas-microsoft-com:vml" xmlns:w10="urn:schemas-microsoft-com:office:word" xmlns:w14="http://schemas.microsoft.com/office/word/2010/wordml" xmlns:w="http://schemas.openxmlformats.org/wordprocessingml/2006/main" xmlns:wne="http://schemas.microsoft.com/office/word/2006/wordml" xmlns:wp14="http://schemas.microsoft.com/office/word/2010/wordprocessingDrawing" xmlns:wp="http://schemas.openxmlformats.org/drawingml/2006/wordprocessingDrawing" xmlns:wpc="http://schemas.microsoft.com/office/word/2010/wordprocessingCanvas" xmlns:wpg="http://schemas.microsoft.com/office/word/2010/wordprocessingGroup" xmlns:wpi="http://schemas.microsoft.com/office/word/2010/wordprocessingInk" xmlns:wps="http://schemas.microsoft.com/office/word/2010/wordprocessingShape" mc:Ignorable="w14 wp14">
-  <w:p>
-    <w:pPr>
-      <w:pStyle w:val="Header"/>
-    </w:pPr>
   </w:p>
 </w:hdr>
 </file>

</xml_diff>